<commit_message>
Rebuild the clean manuscript from the accepted text
The tracked clean build was the round-1 one: no sensitivity analysis, no
segmentation-failure paragraph, no per-model counts, and the AI statement still
naming no model version. Tomography accepted the round-2 text, so the artefact a
proof will be checked against has to be that text and not the previous one.

Highlighted runs: 0. The highlighted build stays as it was uploaded, under its
own name.

Co-Authored-By: Claude Opus 5 <noreply@anthropic.com>
</commit_message>
<xml_diff>
--- a/paper/manuscript_tomography.docx
+++ b/paper/manuscript_tomography.docx
@@ -2,7 +2,7 @@
 <file path=word/document.xml><?xml version="1.0" encoding="utf-8"?>
 <w:document xmlns:w="http://schemas.openxmlformats.org/wordprocessingml/2006/main" xmlns:m="http://schemas.openxmlformats.org/officeDocument/2006/math" xmlns:r="http://schemas.openxmlformats.org/officeDocument/2006/relationships" xmlns:o="urn:schemas-microsoft-com:office:office" xmlns:v="urn:schemas-microsoft-com:vml" xmlns:w10="urn:schemas-microsoft-com:office:word" xmlns:a="http://schemas.openxmlformats.org/drawingml/2006/main" xmlns:pic="http://schemas.openxmlformats.org/drawingml/2006/picture" xmlns:wp="http://schemas.openxmlformats.org/drawingml/2006/wordprocessingDrawing">
   <w:body>
-    <w:bookmarkStart w:id="60" w:name="X8262add42ea8d56622f6b373f153214da92c143"/>
+    <w:bookmarkStart w:id="61" w:name="X8262add42ea8d56622f6b373f153214da92c143"/>
     <w:p>
       <w:pPr>
         <w:pStyle w:val="Heading1"/>
@@ -992,7 +992,7 @@
       </w:r>
     </w:p>
     <w:bookmarkEnd w:id="11"/>
-    <w:bookmarkStart w:id="27" w:name="materials-and-methods"/>
+    <w:bookmarkStart w:id="28" w:name="materials-and-methods"/>
     <w:p>
       <w:pPr>
         <w:pStyle w:val="Heading2"/>
@@ -2129,6 +2129,130 @@
       </w:r>
       <w:r>
         <w:t xml:space="preserve">is therefore expected to flag real anatomy, and does.</w:t>
+      </w:r>
+    </w:p>
+    <w:p>
+      <w:pPr>
+        <w:pStyle w:val="BodyText"/>
+      </w:pPr>
+      <w:r>
+        <w:t xml:space="preserve">The opposite tail does not admit that explanation. The smallest mass in the cohort is a</w:t>
+      </w:r>
+      <w:r>
+        <w:t xml:space="preserve"> </w:t>
+      </w:r>
+      <w:r>
+        <w:t xml:space="preserve">left kidney of 4.3 g on a Philips Brilliance 64 series, segmented at 4.0 cm³ and not</w:t>
+      </w:r>
+      <w:r>
+        <w:t xml:space="preserve"> </w:t>
+      </w:r>
+      <w:r>
+        <w:t xml:space="preserve">truncated by the scan boundary. No adult kidney is that size, so this is a failed mask</w:t>
+      </w:r>
+      <w:r>
+        <w:t xml:space="preserve"> </w:t>
+      </w:r>
+      <w:r>
+        <w:t xml:space="preserve">rather than unusual anatomy: the mass plausibility check flagged it, and it is the one</w:t>
+      </w:r>
+      <w:r>
+        <w:t xml:space="preserve"> </w:t>
+      </w:r>
+      <w:r>
+        <w:t xml:space="preserve">segmentation failure the cohort contains. It is reported here and retained in the</w:t>
+      </w:r>
+      <w:r>
+        <w:t xml:space="preserve"> </w:t>
+      </w:r>
+      <w:r>
+        <w:t xml:space="preserve">analysis rather than removed, because a cohort with its failures deleted cannot be</w:t>
+      </w:r>
+      <w:r>
+        <w:t xml:space="preserve"> </w:t>
+      </w:r>
+      <w:r>
+        <w:t xml:space="preserve">audited. Its effect is small and is stated so that the reader does not have to take that</w:t>
+      </w:r>
+      <w:r>
+        <w:t xml:space="preserve"> </w:t>
+      </w:r>
+      <w:r>
+        <w:t xml:space="preserve">on trust: excluding it moves the published median left-kidney modulation weight from 1.036 to</w:t>
+      </w:r>
+      <w:r>
+        <w:t xml:space="preserve"> </w:t>
+      </w:r>
+      <w:r>
+        <w:t xml:space="preserve">1.035.</w:t>
+      </w:r>
+      <w:r>
+        <w:t xml:space="preserve"> </w:t>
+      </w:r>
+      <w:r>
+        <w:t xml:space="preserve">It is annotated in the mass comparison of Section 3.5.</w:t>
+      </w:r>
+    </w:p>
+    <w:p>
+      <w:pPr>
+        <w:pStyle w:val="BodyText"/>
+      </w:pPr>
+      <w:r>
+        <w:t xml:space="preserve">That case also marks the boundary of what these checks can do. They are automated</w:t>
+      </w:r>
+      <w:r>
+        <w:t xml:space="preserve"> </w:t>
+      </w:r>
+      <w:r>
+        <w:t xml:space="preserve">assertions about laterality, ordering and mass, applied without a reference segmentation,</w:t>
+      </w:r>
+      <w:r>
+        <w:t xml:space="preserve"> </w:t>
+      </w:r>
+      <w:r>
+        <w:t xml:space="preserve">because none exists for this cohort — the images are public and de-identified, and no</w:t>
+      </w:r>
+      <w:r>
+        <w:t xml:space="preserve"> </w:t>
+      </w:r>
+      <w:r>
+        <w:t xml:space="preserve">manually corrected masks accompany them. Checks of that kind detect gross failure</w:t>
+      </w:r>
+      <w:r>
+        <w:t xml:space="preserve"> </w:t>
+      </w:r>
+      <w:r>
+        <w:t xml:space="preserve">reliably: a mirrored volume, an inverted ordering, a mask that has collapsed or leaked far</w:t>
+      </w:r>
+      <w:r>
+        <w:t xml:space="preserve"> </w:t>
+      </w:r>
+      <w:r>
+        <w:t xml:space="preserve">enough to move the organ’s mass outside a wide band. They cannot detect a mask that is</w:t>
+      </w:r>
+      <w:r>
+        <w:t xml:space="preserve"> </w:t>
+      </w:r>
+      <w:r>
+        <w:t xml:space="preserve">systematically displaced yet plausible — a boundary drawn a few millimetres into</w:t>
+      </w:r>
+      <w:r>
+        <w:t xml:space="preserve"> </w:t>
+      </w:r>
+      <w:r>
+        <w:t xml:space="preserve">neighbouring tissue throughout, which leaves laterality, ordering and mass all within</w:t>
+      </w:r>
+      <w:r>
+        <w:t xml:space="preserve"> </w:t>
+      </w:r>
+      <w:r>
+        <w:t xml:space="preserve">range. Quantifying that residual error would require a manually corrected reference</w:t>
+      </w:r>
+      <w:r>
+        <w:t xml:space="preserve"> </w:t>
+      </w:r>
+      <w:r>
+        <w:t xml:space="preserve">standard, which this study does not have and does not claim.</w:t>
       </w:r>
     </w:p>
     <w:p>
@@ -3705,8 +3829,74 @@
       </w:r>
     </w:p>
     <w:bookmarkEnd w:id="26"/>
+    <w:bookmarkStart w:id="27" w:name="X662c2d66dd1eda3268d2087202c966cd73b2601"/>
+    <w:p>
+      <w:pPr>
+        <w:pStyle w:val="Heading3"/>
+      </w:pPr>
+      <w:r>
+        <w:t xml:space="preserve">2.13. Use of Generative Artificial Intelligence</w:t>
+      </w:r>
+    </w:p>
+    <w:p>
+      <w:pPr>
+        <w:pStyle w:val="FirstParagraph"/>
+      </w:pPr>
+      <w:r>
+        <w:t xml:space="preserve">A generative artificial intelligence assistant (Claude Opus 5, Anthropic) was used as a</w:t>
+      </w:r>
+      <w:r>
+        <w:t xml:space="preserve"> </w:t>
+      </w:r>
+      <w:r>
+        <w:t xml:space="preserve">tool in developing the software described in Sections 2.1 to 2.12 and in drafting and</w:t>
+      </w:r>
+      <w:r>
+        <w:t xml:space="preserve"> </w:t>
+      </w:r>
+      <w:r>
+        <w:t xml:space="preserve">editing the text of this manuscript. It was not used to generate, impute or select any</w:t>
+      </w:r>
+      <w:r>
+        <w:t xml:space="preserve"> </w:t>
+      </w:r>
+      <w:r>
+        <w:t xml:space="preserve">reported value. Every number in this article is produced by executable code in the cited</w:t>
+      </w:r>
+      <w:r>
+        <w:t xml:space="preserve"> </w:t>
+      </w:r>
+      <w:r>
+        <w:t xml:space="preserve">repository, is re-derived from the per-series records by the automated test suite</w:t>
+      </w:r>
+      <w:r>
+        <w:t xml:space="preserve"> </w:t>
+      </w:r>
+      <w:r>
+        <w:t xml:space="preserve">described above, and was verified by the author against the underlying records. The</w:t>
+      </w:r>
+      <w:r>
+        <w:t xml:space="preserve"> </w:t>
+      </w:r>
+      <w:r>
+        <w:t xml:space="preserve">study design, the eligibility rules, the quality-control criteria and all scientific</w:t>
+      </w:r>
+      <w:r>
+        <w:t xml:space="preserve"> </w:t>
+      </w:r>
+      <w:r>
+        <w:t xml:space="preserve">judgements, interpretations and conclusions are the author’s, who takes full</w:t>
+      </w:r>
+      <w:r>
+        <w:t xml:space="preserve"> </w:t>
+      </w:r>
+      <w:r>
+        <w:t xml:space="preserve">responsibility for the content of this article.</w:t>
+      </w:r>
+    </w:p>
     <w:bookmarkEnd w:id="27"/>
-    <w:bookmarkStart w:id="49" w:name="results"/>
+    <w:bookmarkEnd w:id="28"/>
+    <w:bookmarkStart w:id="50" w:name="results"/>
     <w:p>
       <w:pPr>
         <w:pStyle w:val="Heading2"/>
@@ -3715,7 +3905,7 @@
         <w:t xml:space="preserve">3. Results</w:t>
       </w:r>
     </w:p>
-    <w:bookmarkStart w:id="31" w:name="cohort-and-records"/>
+    <w:bookmarkStart w:id="32" w:name="cohort-and-records"/>
     <w:p>
       <w:pPr>
         <w:pStyle w:val="Heading3"/>
@@ -3797,18 +3987,18 @@
           <wp:inline>
             <wp:extent cx="4957010" cy="5784324"/>
             <wp:effectExtent b="0" l="0" r="0" t="0"/>
-            <wp:docPr descr="" title="" id="29" name="Picture"/>
+            <wp:docPr descr="" title="" id="30" name="Picture"/>
             <a:graphic>
               <a:graphicData uri="http://schemas.openxmlformats.org/drawingml/2006/picture">
                 <pic:pic>
                   <pic:nvPicPr>
-                    <pic:cNvPr descr="figures/fig2_segmentation.png" id="30" name="Picture"/>
+                    <pic:cNvPr descr="figures/fig2_segmentation.png" id="31" name="Picture"/>
                     <pic:cNvPicPr>
                       <a:picLocks noChangeArrowheads="1" noChangeAspect="1"/>
                     </pic:cNvPicPr>
                   </pic:nvPicPr>
                   <pic:blipFill>
-                    <a:blip r:embed="rId28"/>
+                    <a:blip r:embed="rId29"/>
                     <a:stretch>
                       <a:fillRect/>
                     </a:stretch>
@@ -3946,8 +4136,8 @@
         <w:t xml:space="preserve">Imaging Archive is shown.</w:t>
       </w:r>
     </w:p>
-    <w:bookmarkEnd w:id="31"/>
-    <w:bookmarkStart w:id="35" w:name="organ-specific-modulation-weights"/>
+    <w:bookmarkEnd w:id="32"/>
+    <w:bookmarkStart w:id="36" w:name="organ-specific-modulation-weights"/>
     <w:p>
       <w:pPr>
         <w:pStyle w:val="Heading3"/>
@@ -4035,18 +4225,18 @@
           <wp:inline>
             <wp:extent cx="5334000" cy="4659094"/>
             <wp:effectExtent b="0" l="0" r="0" t="0"/>
-            <wp:docPr descr="" title="" id="33" name="Picture"/>
+            <wp:docPr descr="" title="" id="34" name="Picture"/>
             <a:graphic>
               <a:graphicData uri="http://schemas.openxmlformats.org/drawingml/2006/picture">
                 <pic:pic>
                   <pic:nvPicPr>
-                    <pic:cNvPr descr="figures/fig3_demonstration_case.png" id="34" name="Picture"/>
+                    <pic:cNvPr descr="figures/fig3_demonstration_case.png" id="35" name="Picture"/>
                     <pic:cNvPicPr>
                       <a:picLocks noChangeArrowheads="1" noChangeAspect="1"/>
                     </pic:cNvPicPr>
                   </pic:nvPicPr>
                   <pic:blipFill>
-                    <a:blip r:embed="rId32"/>
+                    <a:blip r:embed="rId33"/>
                     <a:stretch>
                       <a:fillRect/>
                     </a:stretch>
@@ -4135,8 +4325,8 @@
         <w:t xml:space="preserve">are modulation-weighted indices, not absorbed doses.</w:t>
       </w:r>
     </w:p>
-    <w:bookmarkEnd w:id="35"/>
-    <w:bookmarkStart w:id="39" w:name="X1e80acbb71a080ba11eed7c879b65fdaf9935e5"/>
+    <w:bookmarkEnd w:id="36"/>
+    <w:bookmarkStart w:id="40" w:name="X1e80acbb71a080ba11eed7c879b65fdaf9935e5"/>
     <w:p>
       <w:pPr>
         <w:pStyle w:val="Heading3"/>
@@ -4218,18 +4408,18 @@
           <wp:inline>
             <wp:extent cx="5334000" cy="2898815"/>
             <wp:effectExtent b="0" l="0" r="0" t="0"/>
-            <wp:docPr descr="" title="" id="37" name="Picture"/>
+            <wp:docPr descr="" title="" id="38" name="Picture"/>
             <a:graphic>
               <a:graphicData uri="http://schemas.openxmlformats.org/drawingml/2006/picture">
                 <pic:pic>
                   <pic:nvPicPr>
-                    <pic:cNvPr descr="figures/fig4_dose_index_availability.png" id="38" name="Picture"/>
+                    <pic:cNvPr descr="figures/fig4_dose_index_availability.png" id="39" name="Picture"/>
                     <pic:cNvPicPr>
                       <a:picLocks noChangeArrowheads="1" noChangeAspect="1"/>
                     </pic:cNvPicPr>
                   </pic:nvPicPr>
                   <pic:blipFill>
-                    <a:blip r:embed="rId36"/>
+                    <a:blip r:embed="rId37"/>
                     <a:stretch>
                       <a:fillRect/>
                     </a:stretch>
@@ -4292,8 +4482,8 @@
         <w:t xml:space="preserve">distinguished by fill pattern as well as tone.</w:t>
       </w:r>
     </w:p>
-    <w:bookmarkEnd w:id="39"/>
-    <w:bookmarkStart w:id="40" w:name="Xd90e4020bed89f40d261fe1605a683ce49c20ad"/>
+    <w:bookmarkEnd w:id="40"/>
+    <w:bookmarkStart w:id="41" w:name="Xd90e4020bed89f40d261fe1605a683ce49c20ad"/>
     <w:p>
       <w:pPr>
         <w:pStyle w:val="Heading3"/>
@@ -4439,13 +4629,13 @@
         <w:t xml:space="preserve"> </w:t>
       </w:r>
       <w:r>
-        <w:t xml:space="preserve">1 is a Philips iCT 256, measured at +7.7%; the other 4 are GE, on models the comparison</w:t>
-      </w:r>
-      <w:r>
-        <w:t xml:space="preserve"> </w:t>
-      </w:r>
-      <w:r>
-        <w:t xml:space="preserve">cannot reach. The reconstruction is therefore unverified precisely where this study</w:t>
+        <w:t xml:space="preserve">1 is a Philips iCT 256, a model measured above at a median −2.0%; the other 4 are GE, on</w:t>
+      </w:r>
+      <w:r>
+        <w:t xml:space="preserve"> </w:t>
+      </w:r>
+      <w:r>
+        <w:t xml:space="preserve">models the comparison cannot reach. The reconstruction is therefore unverified precisely where this study</w:t>
       </w:r>
       <w:r>
         <w:t xml:space="preserve"> </w:t>
@@ -4460,8 +4650,8 @@
         <w:t xml:space="preserve">method. Results resting on a reconstructed value are marked as such throughout.</w:t>
       </w:r>
     </w:p>
-    <w:bookmarkEnd w:id="40"/>
-    <w:bookmarkStart w:id="44" w:name="X70cbf5043a3c777e943a08818979130bc3ea1a7"/>
+    <w:bookmarkEnd w:id="41"/>
+    <w:bookmarkStart w:id="45" w:name="X70cbf5043a3c777e943a08818979130bc3ea1a7"/>
     <w:p>
       <w:pPr>
         <w:pStyle w:val="Heading3"/>
@@ -4847,18 +5037,18 @@
           <wp:inline>
             <wp:extent cx="5147224" cy="2942580"/>
             <wp:effectExtent b="0" l="0" r="0" t="0"/>
-            <wp:docPr descr="" title="" id="42" name="Picture"/>
+            <wp:docPr descr="" title="" id="43" name="Picture"/>
             <a:graphic>
               <a:graphicData uri="http://schemas.openxmlformats.org/drawingml/2006/picture">
                 <pic:pic>
                   <pic:nvPicPr>
-                    <pic:cNvPr descr="figures/fig5_organ_mass_vs_icrp89.png" id="43" name="Picture"/>
+                    <pic:cNvPr descr="figures/fig5_organ_mass_vs_icrp89.png" id="44" name="Picture"/>
                     <pic:cNvPicPr>
                       <a:picLocks noChangeArrowheads="1" noChangeAspect="1"/>
                     </pic:cNvPicPr>
                   </pic:nvPicPr>
                   <pic:blipFill>
-                    <a:blip r:embed="rId41"/>
+                    <a:blip r:embed="rId42"/>
                     <a:stretch>
                       <a:fillRect/>
                     </a:stretch>
@@ -4924,11 +5114,17 @@
         <w:t xml:space="preserve"> </w:t>
       </w:r>
       <w:r>
-        <w:t xml:space="preserve">readable in greyscale.</w:t>
-      </w:r>
-    </w:p>
-    <w:bookmarkEnd w:id="44"/>
-    <w:bookmarkStart w:id="48" w:name="Xe502f279f709e96f2f22f37520e1c85ca7cf199"/>
+        <w:t xml:space="preserve">readable in greyscale. The annotated point is the one mask the quality control of Section</w:t>
+      </w:r>
+      <w:r>
+        <w:t xml:space="preserve"> </w:t>
+      </w:r>
+      <w:r>
+        <w:t xml:space="preserve">2.6 flagged as a segmentation failure, retained here rather than removed.</w:t>
+      </w:r>
+    </w:p>
+    <w:bookmarkEnd w:id="45"/>
+    <w:bookmarkStart w:id="49" w:name="Xe502f279f709e96f2f22f37520e1c85ca7cf199"/>
     <w:p>
       <w:pPr>
         <w:pStyle w:val="Heading3"/>
@@ -5024,18 +5220,18 @@
           <wp:inline>
             <wp:extent cx="5296186" cy="2342147"/>
             <wp:effectExtent b="0" l="0" r="0" t="0"/>
-            <wp:docPr descr="" title="" id="46" name="Picture"/>
+            <wp:docPr descr="" title="" id="47" name="Picture"/>
             <a:graphic>
               <a:graphicData uri="http://schemas.openxmlformats.org/drawingml/2006/picture">
                 <pic:pic>
                   <pic:nvPicPr>
-                    <pic:cNvPr descr="figures/fig6_study_limits.png" id="47" name="Picture"/>
+                    <pic:cNvPr descr="figures/fig6_study_limits.png" id="48" name="Picture"/>
                     <pic:cNvPicPr>
                       <a:picLocks noChangeArrowheads="1" noChangeAspect="1"/>
                     </pic:cNvPicPr>
                   </pic:nvPicPr>
                   <pic:blipFill>
-                    <a:blip r:embed="rId45"/>
+                    <a:blip r:embed="rId46"/>
                     <a:stretch>
                       <a:fillRect/>
                     </a:stretch>
@@ -5124,9 +5320,9 @@
         <w:t xml:space="preserve">dashed line is the threshold below which a series carries no usable variation.</w:t>
       </w:r>
     </w:p>
-    <w:bookmarkEnd w:id="48"/>
     <w:bookmarkEnd w:id="49"/>
-    <w:bookmarkStart w:id="50" w:name="discussion"/>
+    <w:bookmarkEnd w:id="50"/>
+    <w:bookmarkStart w:id="51" w:name="discussion"/>
     <w:p>
       <w:pPr>
         <w:pStyle w:val="Heading2"/>
@@ -5738,61 +5934,115 @@
           <w:b/>
           <w:bCs/>
         </w:rPr>
-        <w:t xml:space="preserve">Why acquisition constancy has to be screened.</w:t>
-      </w:r>
-      <w:r>
-        <w:t xml:space="preserve"> </w:t>
-      </w:r>
-      <w:r>
-        <w:t xml:space="preserve">The acquisition-constancy criterion</w:t>
-      </w:r>
-      <w:r>
-        <w:t xml:space="preserve"> </w:t>
-      </w:r>
-      <w:r>
-        <w:t xml:space="preserve">identified one series in which tube current alone was not proportional to scanner output,</w:t>
-      </w:r>
-      <w:r>
-        <w:t xml:space="preserve"> </w:t>
-      </w:r>
-      <w:r>
-        <w:t xml:space="preserve">because the acquisition changed rotation and exposure time part-way through. Excluding it</w:t>
-      </w:r>
-      <w:r>
-        <w:t xml:space="preserve"> </w:t>
-      </w:r>
-      <w:r>
-        <w:t xml:space="preserve">prevents a mixed acquisition from entering the quantitative modulation analysis, and</w:t>
-      </w:r>
-      <w:r>
-        <w:t xml:space="preserve"> </w:t>
-      </w:r>
-      <w:r>
-        <w:t xml:space="preserve">illustrates why constancy must be verified rather than assumed: nothing in the images, the</w:t>
-      </w:r>
-      <w:r>
-        <w:t xml:space="preserve"> </w:t>
-      </w:r>
-      <w:r>
-        <w:t xml:space="preserve">segmentation or the weights themselves would have revealed it. A current–time product</w:t>
-      </w:r>
-      <w:r>
-        <w:t xml:space="preserve"> </w:t>
-      </w:r>
-      <w:r>
-        <w:t xml:space="preserve">would be the more faithful weighting in general; it is not adopted here because exposure</w:t>
-      </w:r>
-      <w:r>
-        <w:t xml:space="preserve"> </w:t>
-      </w:r>
-      <w:r>
-        <w:t xml:space="preserve">time is absent from the archived headers of one other series and could not be applied</w:t>
-      </w:r>
-      <w:r>
-        <w:t xml:space="preserve"> </w:t>
-      </w:r>
-      <w:r>
-        <w:t xml:space="preserve">uniformly across the cohort.</w:t>
+        <w:t xml:space="preserve">What the reconstructed values do to the index, and what they do not.</w:t>
+      </w:r>
+      <w:r>
+        <w:t xml:space="preserve"> </w:t>
+      </w:r>
+      <w:r>
+        <w:t xml:space="preserve">Section 3.4</w:t>
+      </w:r>
+      <w:r>
+        <w:t xml:space="preserve"> </w:t>
+      </w:r>
+      <w:r>
+        <w:t xml:space="preserve">measures how far a reconstructed CTDIvol departs from a recorded one; the question that</w:t>
+      </w:r>
+      <w:r>
+        <w:t xml:space="preserve"> </w:t>
+      </w:r>
+      <w:r>
+        <w:t xml:space="preserve">follows is what such a departure does to the index built on it, and the two halves of the</w:t>
+      </w:r>
+      <w:r>
+        <w:t xml:space="preserve"> </w:t>
+      </w:r>
+      <w:r>
+        <w:t xml:space="preserve">answer are of different kinds. The first is structural. The modulation weight is a ratio of</w:t>
+      </w:r>
+      <w:r>
+        <w:t xml:space="preserve"> </w:t>
+      </w:r>
+      <w:r>
+        <w:t xml:space="preserve">tube currents, as defined in Section 2.8, and CTDIvol does not enter it; the index is that</w:t>
+      </w:r>
+      <w:r>
+        <w:t xml:space="preserve"> </w:t>
+      </w:r>
+      <w:r>
+        <w:t xml:space="preserve">weight multiplied by CTDIvol. An error in CTDIvol therefore appears in the index at 1:1</w:t>
+      </w:r>
+      <w:r>
+        <w:t xml:space="preserve"> </w:t>
+      </w:r>
+      <w:r>
+        <w:t xml:space="preserve">and cannot reach the weight at all, so the modulation results of Section 3.2 are</w:t>
+      </w:r>
+      <w:r>
+        <w:t xml:space="preserve"> </w:t>
+      </w:r>
+      <w:r>
+        <w:t xml:space="preserve">independent of it by construction rather than by measurement. The second half is</w:t>
+      </w:r>
+      <w:r>
+        <w:t xml:space="preserve"> </w:t>
+      </w:r>
+      <w:r>
+        <w:t xml:space="preserve">empirical, and concerns how much of the cohort is exposed. Of the 33 series carrying an</w:t>
+      </w:r>
+      <w:r>
+        <w:t xml:space="preserve"> </w:t>
+      </w:r>
+      <w:r>
+        <w:t xml:space="preserve">index, 4 rest on a reconstructed CTDIvol, covering 44 of 334 organ records. Recomputing</w:t>
+      </w:r>
+      <w:r>
+        <w:t xml:space="preserve"> </w:t>
+      </w:r>
+      <w:r>
+        <w:t xml:space="preserve">every table over the series with a recorded value alone moves the per-organ median</w:t>
+      </w:r>
+      <w:r>
+        <w:t xml:space="preserve"> </w:t>
+      </w:r>
+      <w:r>
+        <w:t xml:space="preserve">modulation weight by at most 0.048 and the per-organ median anatomy-weighted CTDIvol by at</w:t>
+      </w:r>
+      <w:r>
+        <w:t xml:space="preserve"> </w:t>
+      </w:r>
+      <w:r>
+        <w:t xml:space="preserve">most 1.11 mGy. The conclusions of this study do not depend on those 4 series — but the</w:t>
+      </w:r>
+      <w:r>
+        <w:t xml:space="preserve"> </w:t>
+      </w:r>
+      <w:r>
+        <w:t xml:space="preserve">reason for saying so is not that they can be discarded. Removing them removes GE from the</w:t>
+      </w:r>
+      <w:r>
+        <w:t xml:space="preserve"> </w:t>
+      </w:r>
+      <w:r>
+        <w:t xml:space="preserve">weighted tables entirely, from 3 series to none, because no GE series in this cohort</w:t>
+      </w:r>
+      <w:r>
+        <w:t xml:space="preserve"> </w:t>
+      </w:r>
+      <w:r>
+        <w:t xml:space="preserve">retained a recorded CTDIvol at all. The multi-vendor reach of the modulation results rests</w:t>
+      </w:r>
+      <w:r>
+        <w:t xml:space="preserve"> </w:t>
+      </w:r>
+      <w:r>
+        <w:t xml:space="preserve">on values whose accuracy Section 3.4 could not check, and that is the honest statement of</w:t>
+      </w:r>
+      <w:r>
+        <w:t xml:space="preserve"> </w:t>
+      </w:r>
+      <w:r>
+        <w:t xml:space="preserve">where this study is weakest.</w:t>
       </w:r>
     </w:p>
     <w:p>
@@ -5804,70 +6054,61 @@
           <w:b/>
           <w:bCs/>
         </w:rPr>
-        <w:t xml:space="preserve">Reproducibility and open implementation.</w:t>
-      </w:r>
-      <w:r>
-        <w:t xml:space="preserve"> </w:t>
-      </w:r>
-      <w:r>
-        <w:t xml:space="preserve">The implementation is MIT-licensed, no</w:t>
-      </w:r>
-      <w:r>
-        <w:t xml:space="preserve"> </w:t>
-      </w:r>
-      <w:r>
-        <w:t xml:space="preserve">imaging is redistributed, and every reported value is re-derived from the per-series</w:t>
-      </w:r>
-      <w:r>
-        <w:t xml:space="preserve"> </w:t>
-      </w:r>
-      <w:r>
-        <w:t xml:space="preserve">records by an automated test suite that regenerates the analysis tables and compares them.</w:t>
-      </w:r>
-      <w:r>
-        <w:t xml:space="preserve"> </w:t>
-      </w:r>
-      <w:r>
-        <w:t xml:space="preserve">The acquisition procedure, the analysis and the figures are each a single command. The</w:t>
-      </w:r>
-      <w:r>
-        <w:t xml:space="preserve"> </w:t>
-      </w:r>
-      <w:r>
-        <w:t xml:space="preserve">components differ in status and are not claimed as uniformly open: the imaging is publicly</w:t>
-      </w:r>
-      <w:r>
-        <w:t xml:space="preserve"> </w:t>
-      </w:r>
-      <w:r>
-        <w:t xml:space="preserve">accessible under collection-specific licences; the segmentation software and the</w:t>
-      </w:r>
-      <w:r>
-        <w:t xml:space="preserve"> </w:t>
-      </w:r>
-      <w:r>
-        <w:rPr>
-          <w:rStyle w:val="VerbatimChar"/>
-        </w:rPr>
-        <w:t xml:space="preserve">total</w:t>
-      </w:r>
-      <w:r>
-        <w:t xml:space="preserve"> </w:t>
-      </w:r>
-      <w:r>
-        <w:t xml:space="preserve">task weights are openly redistributable; the normalised-CTDI database is CC BY; the</w:t>
-      </w:r>
-      <w:r>
-        <w:t xml:space="preserve"> </w:t>
-      </w:r>
-      <w:r>
-        <w:t xml:space="preserve">HU-to-density anchor values are used by citation to ICRU Report 44 [16] and Schneider et</w:t>
-      </w:r>
-      <w:r>
-        <w:t xml:space="preserve"> </w:t>
-      </w:r>
-      <w:r>
-        <w:t xml:space="preserve">al. [17] rather than redistributed; and no Monte-Carlo coefficient table is included at all.</w:t>
+        <w:t xml:space="preserve">Why acquisition constancy has to be screened.</w:t>
+      </w:r>
+      <w:r>
+        <w:t xml:space="preserve"> </w:t>
+      </w:r>
+      <w:r>
+        <w:t xml:space="preserve">The acquisition-constancy criterion</w:t>
+      </w:r>
+      <w:r>
+        <w:t xml:space="preserve"> </w:t>
+      </w:r>
+      <w:r>
+        <w:t xml:space="preserve">identified one series in which tube current alone was not proportional to scanner output,</w:t>
+      </w:r>
+      <w:r>
+        <w:t xml:space="preserve"> </w:t>
+      </w:r>
+      <w:r>
+        <w:t xml:space="preserve">because the acquisition changed rotation and exposure time part-way through. Excluding it</w:t>
+      </w:r>
+      <w:r>
+        <w:t xml:space="preserve"> </w:t>
+      </w:r>
+      <w:r>
+        <w:t xml:space="preserve">prevents a mixed acquisition from entering the quantitative modulation analysis, and</w:t>
+      </w:r>
+      <w:r>
+        <w:t xml:space="preserve"> </w:t>
+      </w:r>
+      <w:r>
+        <w:t xml:space="preserve">illustrates why constancy must be verified rather than assumed: nothing in the images, the</w:t>
+      </w:r>
+      <w:r>
+        <w:t xml:space="preserve"> </w:t>
+      </w:r>
+      <w:r>
+        <w:t xml:space="preserve">segmentation or the weights themselves would have revealed it. A current–time product</w:t>
+      </w:r>
+      <w:r>
+        <w:t xml:space="preserve"> </w:t>
+      </w:r>
+      <w:r>
+        <w:t xml:space="preserve">would be the more faithful weighting in general; it is not adopted here because exposure</w:t>
+      </w:r>
+      <w:r>
+        <w:t xml:space="preserve"> </w:t>
+      </w:r>
+      <w:r>
+        <w:t xml:space="preserve">time is absent from the archived headers of one other series and could not be applied</w:t>
+      </w:r>
+      <w:r>
+        <w:t xml:space="preserve"> </w:t>
+      </w:r>
+      <w:r>
+        <w:t xml:space="preserve">uniformly across the cohort.</w:t>
       </w:r>
     </w:p>
     <w:p>
@@ -5879,73 +6120,70 @@
           <w:b/>
           <w:bCs/>
         </w:rPr>
-        <w:t xml:space="preserve">The boundary to absorbed organ dose.</w:t>
-      </w:r>
-      <w:r>
-        <w:t xml:space="preserve"> </w:t>
-      </w:r>
-      <w:r>
-        <w:t xml:space="preserve">Converting an anatomy-weighted index into an</w:t>
-      </w:r>
-      <w:r>
-        <w:t xml:space="preserve"> </w:t>
-      </w:r>
-      <w:r>
-        <w:t xml:space="preserve">absorbed organ dose requires CTDIvol-normalised coefficients with a patient-size</w:t>
-      </w:r>
-      <w:r>
-        <w:t xml:space="preserve"> </w:t>
-      </w:r>
-      <w:r>
-        <w:t xml:space="preserve">correction, of the kind applied over patient model libraries by Tian et al. [4], together</w:t>
-      </w:r>
-      <w:r>
-        <w:t xml:space="preserve"> </w:t>
-      </w:r>
-      <w:r>
-        <w:t xml:space="preserve">with the transport considerations listed in</w:t>
-      </w:r>
-      <w:r>
-        <w:t xml:space="preserve"> </w:t>
-      </w:r>
-      <w:r>
-        <w:t xml:space="preserve">Section 2.11. Those coefficient sets are published in subscription journals or distributed</w:t>
-      </w:r>
-      <w:r>
-        <w:t xml:space="preserve"> </w:t>
-      </w:r>
-      <w:r>
-        <w:t xml:space="preserve">with research software under terms granting use but not redistribution, which reflects a</w:t>
-      </w:r>
-      <w:r>
-        <w:t xml:space="preserve"> </w:t>
-      </w:r>
-      <w:r>
-        <w:t xml:space="preserve">publishing convention for Monte-Carlo reference data rather than any deficiency in the</w:t>
-      </w:r>
-      <w:r>
-        <w:t xml:space="preserve"> </w:t>
-      </w:r>
-      <w:r>
-        <w:t xml:space="preserve">coefficients themselves. Normalised-CTDI data of the kind used here to reconstruct a</w:t>
-      </w:r>
-      <w:r>
-        <w:t xml:space="preserve"> </w:t>
-      </w:r>
-      <w:r>
-        <w:t xml:space="preserve">missing whole-scan index has been published under CC BY [18], which shows the convention is</w:t>
-      </w:r>
-      <w:r>
-        <w:t xml:space="preserve"> </w:t>
-      </w:r>
-      <w:r>
-        <w:t xml:space="preserve">movable. The software accordingly refuses to emit a dose in milligray unless supplied with</w:t>
-      </w:r>
-      <w:r>
-        <w:t xml:space="preserve"> </w:t>
-      </w:r>
-      <w:r>
-        <w:t xml:space="preserve">a coefficient table carrying its citation, DOI, licence and source hash.</w:t>
+        <w:t xml:space="preserve">Reproducibility and open implementation.</w:t>
+      </w:r>
+      <w:r>
+        <w:t xml:space="preserve"> </w:t>
+      </w:r>
+      <w:r>
+        <w:t xml:space="preserve">The implementation is MIT-licensed, no</w:t>
+      </w:r>
+      <w:r>
+        <w:t xml:space="preserve"> </w:t>
+      </w:r>
+      <w:r>
+        <w:t xml:space="preserve">imaging is redistributed, and every reported value is re-derived from the per-series</w:t>
+      </w:r>
+      <w:r>
+        <w:t xml:space="preserve"> </w:t>
+      </w:r>
+      <w:r>
+        <w:t xml:space="preserve">records by an automated test suite that regenerates the analysis tables and compares them.</w:t>
+      </w:r>
+      <w:r>
+        <w:t xml:space="preserve"> </w:t>
+      </w:r>
+      <w:r>
+        <w:t xml:space="preserve">The acquisition procedure, the analysis and the figures are each a single command. The</w:t>
+      </w:r>
+      <w:r>
+        <w:t xml:space="preserve"> </w:t>
+      </w:r>
+      <w:r>
+        <w:t xml:space="preserve">components differ in status and are not claimed as uniformly open: the imaging is publicly</w:t>
+      </w:r>
+      <w:r>
+        <w:t xml:space="preserve"> </w:t>
+      </w:r>
+      <w:r>
+        <w:t xml:space="preserve">accessible under collection-specific licences; the segmentation software and the</w:t>
+      </w:r>
+      <w:r>
+        <w:t xml:space="preserve"> </w:t>
+      </w:r>
+      <w:r>
+        <w:rPr>
+          <w:rStyle w:val="VerbatimChar"/>
+        </w:rPr>
+        <w:t xml:space="preserve">total</w:t>
+      </w:r>
+      <w:r>
+        <w:t xml:space="preserve"> </w:t>
+      </w:r>
+      <w:r>
+        <w:t xml:space="preserve">task weights are openly redistributable; the normalised-CTDI database is CC BY; the</w:t>
+      </w:r>
+      <w:r>
+        <w:t xml:space="preserve"> </w:t>
+      </w:r>
+      <w:r>
+        <w:t xml:space="preserve">HU-to-density anchor values are used by citation to ICRU Report 44 [16] and Schneider et</w:t>
+      </w:r>
+      <w:r>
+        <w:t xml:space="preserve"> </w:t>
+      </w:r>
+      <w:r>
+        <w:t xml:space="preserve">al. [17] rather than redistributed; and no Monte-Carlo coefficient table is included at all.</w:t>
       </w:r>
     </w:p>
     <w:p>
@@ -5957,79 +6195,73 @@
           <w:b/>
           <w:bCs/>
         </w:rPr>
-        <w:t xml:space="preserve">Limitations.</w:t>
-      </w:r>
-      <w:r>
-        <w:t xml:space="preserve"> </w:t>
-      </w:r>
-      <w:r>
-        <w:t xml:space="preserve">Ten series per manufacturer supports a median and an interquartile range,</w:t>
-      </w:r>
-      <w:r>
-        <w:t xml:space="preserve"> </w:t>
-      </w:r>
-      <w:r>
-        <w:t xml:space="preserve">not a distributional claim, and series within the archive are not independent with respect</w:t>
-      </w:r>
-      <w:r>
-        <w:t xml:space="preserve"> </w:t>
-      </w:r>
-      <w:r>
-        <w:t xml:space="preserve">to collection, site, scanner model or export pathway. The cohort is oncological and not a</w:t>
-      </w:r>
-      <w:r>
-        <w:t xml:space="preserve"> </w:t>
-      </w:r>
-      <w:r>
-        <w:t xml:space="preserve">reference population. Contrast phase, tube voltage and reconstruction kernel were not</w:t>
-      </w:r>
-      <w:r>
-        <w:t xml:space="preserve"> </w:t>
-      </w:r>
-      <w:r>
-        <w:t xml:space="preserve">controlled, and all affect attenuation-derived mass estimates. A single segmentation model</w:t>
-      </w:r>
-      <w:r>
-        <w:t xml:space="preserve"> </w:t>
-      </w:r>
-      <w:r>
-        <w:t xml:space="preserve">was used, so segmentation behaviour and cohort anatomy cannot be separated. There is no</w:t>
-      </w:r>
-      <w:r>
-        <w:t xml:space="preserve"> </w:t>
-      </w:r>
-      <w:r>
-        <w:t xml:space="preserve">subject-level ground truth for organ mass. Rotation time, pitch and collimation are absent</w:t>
-      </w:r>
-      <w:r>
-        <w:t xml:space="preserve"> </w:t>
-      </w:r>
-      <w:r>
-        <w:t xml:space="preserve">from the archived headers of some series (19, 8 and 9 respectively), so their constancy</w:t>
-      </w:r>
-      <w:r>
-        <w:t xml:space="preserve"> </w:t>
-      </w:r>
-      <w:r>
-        <w:t xml:space="preserve">within those series could not be fully verified and is assumed from the single-acquisition</w:t>
-      </w:r>
-      <w:r>
-        <w:t xml:space="preserve"> </w:t>
-      </w:r>
-      <w:r>
-        <w:t xml:space="preserve">representation; the acquisition-constancy criterion is therefore a screen against</w:t>
-      </w:r>
-      <w:r>
-        <w:t xml:space="preserve"> </w:t>
-      </w:r>
-      <w:r>
-        <w:t xml:space="preserve">detectable violations rather than a guarantee. The index addresses longitudinal modulation</w:t>
-      </w:r>
-      <w:r>
-        <w:t xml:space="preserve"> </w:t>
-      </w:r>
-      <w:r>
-        <w:t xml:space="preserve">only, as set out in Section 2.11, and no absorbed dose is reported.</w:t>
+        <w:t xml:space="preserve">The boundary to absorbed organ dose.</w:t>
+      </w:r>
+      <w:r>
+        <w:t xml:space="preserve"> </w:t>
+      </w:r>
+      <w:r>
+        <w:t xml:space="preserve">Converting an anatomy-weighted index into an</w:t>
+      </w:r>
+      <w:r>
+        <w:t xml:space="preserve"> </w:t>
+      </w:r>
+      <w:r>
+        <w:t xml:space="preserve">absorbed organ dose requires CTDIvol-normalised coefficients with a patient-size</w:t>
+      </w:r>
+      <w:r>
+        <w:t xml:space="preserve"> </w:t>
+      </w:r>
+      <w:r>
+        <w:t xml:space="preserve">correction, of the kind applied over patient model libraries by Tian et al. [4], together</w:t>
+      </w:r>
+      <w:r>
+        <w:t xml:space="preserve"> </w:t>
+      </w:r>
+      <w:r>
+        <w:t xml:space="preserve">with the transport considerations listed in</w:t>
+      </w:r>
+      <w:r>
+        <w:t xml:space="preserve"> </w:t>
+      </w:r>
+      <w:r>
+        <w:t xml:space="preserve">Section 2.11. Those coefficient sets are published in subscription journals or distributed</w:t>
+      </w:r>
+      <w:r>
+        <w:t xml:space="preserve"> </w:t>
+      </w:r>
+      <w:r>
+        <w:t xml:space="preserve">with research software under terms granting use but not redistribution, which reflects a</w:t>
+      </w:r>
+      <w:r>
+        <w:t xml:space="preserve"> </w:t>
+      </w:r>
+      <w:r>
+        <w:t xml:space="preserve">publishing convention for Monte-Carlo reference data rather than any deficiency in the</w:t>
+      </w:r>
+      <w:r>
+        <w:t xml:space="preserve"> </w:t>
+      </w:r>
+      <w:r>
+        <w:t xml:space="preserve">coefficients themselves. Normalised-CTDI data of the kind used here to reconstruct a</w:t>
+      </w:r>
+      <w:r>
+        <w:t xml:space="preserve"> </w:t>
+      </w:r>
+      <w:r>
+        <w:t xml:space="preserve">missing whole-scan index has been published under CC BY [18], which shows the convention is</w:t>
+      </w:r>
+      <w:r>
+        <w:t xml:space="preserve"> </w:t>
+      </w:r>
+      <w:r>
+        <w:t xml:space="preserve">movable. The software accordingly refuses to emit a dose in milligray unless supplied with</w:t>
+      </w:r>
+      <w:r>
+        <w:t xml:space="preserve"> </w:t>
+      </w:r>
+      <w:r>
+        <w:t xml:space="preserve">a coefficient table carrying its citation, DOI, licence and source hash.</w:t>
       </w:r>
     </w:p>
     <w:p>
@@ -6041,6 +6273,126 @@
           <w:b/>
           <w:bCs/>
         </w:rPr>
+        <w:t xml:space="preserve">Limitations.</w:t>
+      </w:r>
+      <w:r>
+        <w:t xml:space="preserve"> </w:t>
+      </w:r>
+      <w:r>
+        <w:t xml:space="preserve">Ten series per manufacturer supports a median and an interquartile range,</w:t>
+      </w:r>
+      <w:r>
+        <w:t xml:space="preserve"> </w:t>
+      </w:r>
+      <w:r>
+        <w:t xml:space="preserve">not a distributional claim, and series within the archive are not independent with respect</w:t>
+      </w:r>
+      <w:r>
+        <w:t xml:space="preserve"> </w:t>
+      </w:r>
+      <w:r>
+        <w:t xml:space="preserve">to collection, site, scanner model or export pathway. The design is balanced by</w:t>
+      </w:r>
+      <w:r>
+        <w:t xml:space="preserve"> </w:t>
+      </w:r>
+      <w:r>
+        <w:t xml:space="preserve">manufacturer and not by scanner model, and the two are not interchangeable: those ten</w:t>
+      </w:r>
+      <w:r>
+        <w:t xml:space="preserve"> </w:t>
+      </w:r>
+      <w:r>
+        <w:t xml:space="preserve">series per manufacturer are spread over 9 distinct GE models, 6 Siemens, 4 Canon/Toshiba</w:t>
+      </w:r>
+      <w:r>
+        <w:t xml:space="preserve"> </w:t>
+      </w:r>
+      <w:r>
+        <w:t xml:space="preserve">and 4 Philips, so most individual models are represented by one to three series. Anything</w:t>
+      </w:r>
+      <w:r>
+        <w:t xml:space="preserve"> </w:t>
+      </w:r>
+      <w:r>
+        <w:t xml:space="preserve">stated here about a manufacturer is therefore a statement about a small, model-diverse</w:t>
+      </w:r>
+      <w:r>
+        <w:t xml:space="preserve"> </w:t>
+      </w:r>
+      <w:r>
+        <w:t xml:space="preserve">sample of that manufacturer’s installed base, and nothing in this study supports a claim</w:t>
+      </w:r>
+      <w:r>
+        <w:t xml:space="preserve"> </w:t>
+      </w:r>
+      <w:r>
+        <w:t xml:space="preserve">at the level of a particular scanner model. The cohort is oncological and not a</w:t>
+      </w:r>
+      <w:r>
+        <w:t xml:space="preserve"> </w:t>
+      </w:r>
+      <w:r>
+        <w:t xml:space="preserve">reference population. Contrast phase, tube voltage and reconstruction kernel were not</w:t>
+      </w:r>
+      <w:r>
+        <w:t xml:space="preserve"> </w:t>
+      </w:r>
+      <w:r>
+        <w:t xml:space="preserve">controlled, and all affect attenuation-derived mass estimates. A single segmentation model</w:t>
+      </w:r>
+      <w:r>
+        <w:t xml:space="preserve"> </w:t>
+      </w:r>
+      <w:r>
+        <w:t xml:space="preserve">was used, so segmentation behaviour and cohort anatomy cannot be separated. There is no</w:t>
+      </w:r>
+      <w:r>
+        <w:t xml:space="preserve"> </w:t>
+      </w:r>
+      <w:r>
+        <w:t xml:space="preserve">subject-level ground truth for organ mass. Rotation time, pitch and collimation are absent</w:t>
+      </w:r>
+      <w:r>
+        <w:t xml:space="preserve"> </w:t>
+      </w:r>
+      <w:r>
+        <w:t xml:space="preserve">from the archived headers of some series (19, 8 and 9 respectively), so their constancy</w:t>
+      </w:r>
+      <w:r>
+        <w:t xml:space="preserve"> </w:t>
+      </w:r>
+      <w:r>
+        <w:t xml:space="preserve">within those series could not be fully verified and is assumed from the single-acquisition</w:t>
+      </w:r>
+      <w:r>
+        <w:t xml:space="preserve"> </w:t>
+      </w:r>
+      <w:r>
+        <w:t xml:space="preserve">representation; the acquisition-constancy criterion is therefore a screen against</w:t>
+      </w:r>
+      <w:r>
+        <w:t xml:space="preserve"> </w:t>
+      </w:r>
+      <w:r>
+        <w:t xml:space="preserve">detectable violations rather than a guarantee. The index addresses longitudinal modulation</w:t>
+      </w:r>
+      <w:r>
+        <w:t xml:space="preserve"> </w:t>
+      </w:r>
+      <w:r>
+        <w:t xml:space="preserve">only, as set out in Section 2.11, and no absorbed dose is reported.</w:t>
+      </w:r>
+    </w:p>
+    <w:p>
+      <w:pPr>
+        <w:pStyle w:val="BodyText"/>
+      </w:pPr>
+      <w:r>
+        <w:rPr>
+          <w:b/>
+          <w:bCs/>
+        </w:rPr>
         <w:t xml:space="preserve">Future work.</w:t>
       </w:r>
       <w:r>
@@ -6080,8 +6432,8 @@
         <w:t xml:space="preserve">rather than confounded.</w:t>
       </w:r>
     </w:p>
-    <w:bookmarkEnd w:id="50"/>
-    <w:bookmarkStart w:id="51" w:name="conclusions"/>
+    <w:bookmarkEnd w:id="51"/>
+    <w:bookmarkStart w:id="52" w:name="conclusions"/>
     <w:p>
       <w:pPr>
         <w:pStyle w:val="Heading2"/>
@@ -6176,8 +6528,8 @@
         <w:t xml:space="preserve">reproducible from the shipped results.</w:t>
       </w:r>
     </w:p>
-    <w:bookmarkEnd w:id="51"/>
-    <w:bookmarkStart w:id="52" w:name="author-contributions"/>
+    <w:bookmarkEnd w:id="52"/>
+    <w:bookmarkStart w:id="53" w:name="author-contributions"/>
     <w:p>
       <w:pPr>
         <w:pStyle w:val="Heading2"/>
@@ -6206,8 +6558,8 @@
         <w:t xml:space="preserve">visualisation. The author has read and agreed to the published version of the manuscript.</w:t>
       </w:r>
     </w:p>
-    <w:bookmarkEnd w:id="52"/>
-    <w:bookmarkStart w:id="53" w:name="funding"/>
+    <w:bookmarkEnd w:id="53"/>
+    <w:bookmarkStart w:id="54" w:name="funding"/>
     <w:p>
       <w:pPr>
         <w:pStyle w:val="Heading2"/>
@@ -6224,8 +6576,8 @@
         <w:t xml:space="preserve">This research received no external funding.</w:t>
       </w:r>
     </w:p>
-    <w:bookmarkEnd w:id="53"/>
-    <w:bookmarkStart w:id="54" w:name="institutional-review-board-statement"/>
+    <w:bookmarkEnd w:id="54"/>
+    <w:bookmarkStart w:id="55" w:name="institutional-review-board-statement"/>
     <w:p>
       <w:pPr>
         <w:pStyle w:val="Heading2"/>
@@ -6284,8 +6636,8 @@
         <w:t xml:space="preserve">were therefore not required.</w:t>
       </w:r>
     </w:p>
-    <w:bookmarkEnd w:id="54"/>
-    <w:bookmarkStart w:id="55" w:name="informed-consent-statement"/>
+    <w:bookmarkEnd w:id="55"/>
+    <w:bookmarkStart w:id="56" w:name="informed-consent-statement"/>
     <w:p>
       <w:pPr>
         <w:pStyle w:val="Heading2"/>
@@ -6308,8 +6660,8 @@
         <w:t xml:space="preserve">Cancer Imaging Archive.</w:t>
       </w:r>
     </w:p>
-    <w:bookmarkEnd w:id="55"/>
-    <w:bookmarkStart w:id="56" w:name="data-availability-statement"/>
+    <w:bookmarkEnd w:id="56"/>
+    <w:bookmarkStart w:id="57" w:name="data-availability-statement"/>
     <w:p>
       <w:pPr>
         <w:pStyle w:val="Heading2"/>
@@ -6488,8 +6840,8 @@
         <w:t xml:space="preserve">Section 4.</w:t>
       </w:r>
     </w:p>
-    <w:bookmarkEnd w:id="56"/>
-    <w:bookmarkStart w:id="57" w:name="conflicts-of-interest"/>
+    <w:bookmarkEnd w:id="57"/>
+    <w:bookmarkStart w:id="58" w:name="conflicts-of-interest"/>
     <w:p>
       <w:pPr>
         <w:pStyle w:val="Heading2"/>
@@ -6530,8 +6882,8 @@
         <w:t xml:space="preserve">proprietary clinical data were used; all imaging is publicly available and de-identified.</w:t>
       </w:r>
     </w:p>
-    <w:bookmarkEnd w:id="57"/>
-    <w:bookmarkStart w:id="58" w:name="X662c2d66dd1eda3268d2087202c966cd73b2601"/>
+    <w:bookmarkEnd w:id="58"/>
+    <w:bookmarkStart w:id="59" w:name="X403f50173cc9f6c2dda70a807554c26161ce17d"/>
     <w:p>
       <w:pPr>
         <w:pStyle w:val="Heading2"/>
@@ -6545,41 +6897,47 @@
         <w:pStyle w:val="FirstParagraph"/>
       </w:pPr>
       <w:r>
-        <w:t xml:space="preserve">A generative artificial intelligence assistant (Claude, Anthropic) was used as a tool in</w:t>
-      </w:r>
-      <w:r>
-        <w:t xml:space="preserve"> </w:t>
-      </w:r>
-      <w:r>
-        <w:t xml:space="preserve">the development of the software and in drafting and editing the text of this manuscript.</w:t>
-      </w:r>
-      <w:r>
-        <w:t xml:space="preserve"> </w:t>
-      </w:r>
-      <w:r>
-        <w:t xml:space="preserve">All reported results are produced by executable code contained in the cited repository,</w:t>
-      </w:r>
-      <w:r>
-        <w:t xml:space="preserve"> </w:t>
-      </w:r>
-      <w:r>
-        <w:t xml:space="preserve">are re-derived from the underlying per-series records by an automated test suite, and were</w:t>
-      </w:r>
-      <w:r>
-        <w:t xml:space="preserve"> </w:t>
-      </w:r>
-      <w:r>
-        <w:t xml:space="preserve">verified by the author. All scientific judgements, interpretations and conclusions are the</w:t>
-      </w:r>
-      <w:r>
-        <w:t xml:space="preserve"> </w:t>
-      </w:r>
-      <w:r>
-        <w:t xml:space="preserve">author’s, who takes full responsibility for the content of this article.</w:t>
-      </w:r>
-    </w:p>
-    <w:bookmarkEnd w:id="58"/>
-    <w:bookmarkStart w:id="59" w:name="references"/>
+        <w:t xml:space="preserve">A generative artificial intelligence assistant (Claude Opus 5, Anthropic) was used as a</w:t>
+      </w:r>
+      <w:r>
+        <w:t xml:space="preserve"> </w:t>
+      </w:r>
+      <w:r>
+        <w:t xml:space="preserve">tool in the development of the software and in drafting and editing the text of this</w:t>
+      </w:r>
+      <w:r>
+        <w:t xml:space="preserve"> </w:t>
+      </w:r>
+      <w:r>
+        <w:t xml:space="preserve">manuscript. All reported results are produced by executable code contained in the cited</w:t>
+      </w:r>
+      <w:r>
+        <w:t xml:space="preserve"> </w:t>
+      </w:r>
+      <w:r>
+        <w:t xml:space="preserve">repository, are re-derived from the underlying per-series records by an automated test</w:t>
+      </w:r>
+      <w:r>
+        <w:t xml:space="preserve"> </w:t>
+      </w:r>
+      <w:r>
+        <w:t xml:space="preserve">suite, and were verified by the author. All scientific judgements, interpretations and</w:t>
+      </w:r>
+      <w:r>
+        <w:t xml:space="preserve"> </w:t>
+      </w:r>
+      <w:r>
+        <w:t xml:space="preserve">conclusions are the author’s, who takes full responsibility for the content of this</w:t>
+      </w:r>
+      <w:r>
+        <w:t xml:space="preserve"> </w:t>
+      </w:r>
+      <w:r>
+        <w:t xml:space="preserve">article.</w:t>
+      </w:r>
+    </w:p>
+    <w:bookmarkEnd w:id="59"/>
+    <w:bookmarkStart w:id="60" w:name="references"/>
     <w:p>
       <w:pPr>
         <w:pStyle w:val="Heading2"/>
@@ -7629,8 +7987,8 @@
         <w:t xml:space="preserve">, 810-816. https://doi.org/10.2214/ajr.14.13693.</w:t>
       </w:r>
     </w:p>
-    <w:bookmarkEnd w:id="59"/>
     <w:bookmarkEnd w:id="60"/>
+    <w:bookmarkEnd w:id="61"/>
     <w:sectPr>
       <w:footnotePr>
         <w:numRestart w:val="eachSect"/>

</xml_diff>

<commit_message>
Point the paper at v0.1.2, and the guard goes green
The Data Availability Statement now resolves to release v0.1.2, commit 0ca9d57,
Zenodo 10.5281/zenodo.22143005 -- verified against the Zenodo API as the version
DOI for 0.1.2, not the concept DOI, which is 10.5281/zenodo.21817234 and
resolves to whatever is latest.

The release-completeness test passes: every results/*.json the manuscript quotes
is in the tree at the tag the paper names. It was failing on two files, one of
them since the round-1 revision.

The clean build refused to run while COMMIT_HASH was empty, which is what it is
for: the tag was cut on GitHub, so the hash was not in this checkout until the
tags were fetched.

Co-Authored-By: Claude Opus 5 <noreply@anthropic.com>
</commit_message>
<xml_diff>
--- a/paper/manuscript_tomography.docx
+++ b/paper/manuscript_tomography.docx
@@ -6699,13 +6699,13 @@
         <w:t xml:space="preserve"> </w:t>
       </w:r>
       <w:r>
-        <w:t xml:space="preserve">v0.1.1 (commit 46edee6423ddc19b47efae180d8edf527299d066), archived at Zenodo under</w:t>
-      </w:r>
-      <w:r>
-        <w:t xml:space="preserve"> </w:t>
-      </w:r>
-      <w:r>
-        <w:t xml:space="preserve">10.5281/zenodo.21817307. The machine-readable results the manuscript quotes, the per-organ</w:t>
+        <w:t xml:space="preserve">v0.1.2 (commit 0ca9d57ef9fbc1a321cd5b671d21eb5857def518), archived at Zenodo under</w:t>
+      </w:r>
+      <w:r>
+        <w:t xml:space="preserve"> </w:t>
+      </w:r>
+      <w:r>
+        <w:t xml:space="preserve">10.5281/zenodo.22143005. The machine-readable results the manuscript quotes, the per-organ</w:t>
       </w:r>
       <w:r>
         <w:t xml:space="preserve"> </w:t>

</xml_diff>